<commit_message>
Apply latest review document translation and pagination rules
</commit_message>
<xml_diff>
--- a/templates/review-docs/review-form.docx
+++ b/templates/review-docs/review-form.docx
@@ -22,7 +22,6 @@
       </w:tblGrid>
       <w:tr>
         <w:trPr>
-          <w:cantSplit/>
           <w:trHeight w:val="1690"/>
         </w:trPr>
         <w:tc>
@@ -33,6 +32,8 @@
           </w:tcPr>
           <w:p>
             <w:pPr>
+              <w:keepNext w:val="0"/>
+              <w:keepLines w:val="0"/>
               <w:jc w:val="center"/>
               <w:spacing w:after="0"/>
             </w:pPr>
@@ -52,7 +53,6 @@
       </w:tr>
       <w:tr>
         <w:trPr>
-          <w:cantSplit/>
           <w:trHeight w:val="833"/>
         </w:trPr>
         <w:tc>
@@ -63,6 +63,8 @@
           </w:tcPr>
           <w:p>
             <w:pPr>
+              <w:keepNext w:val="0"/>
+              <w:keepLines w:val="0"/>
               <w:jc w:val="center"/>
               <w:spacing w:after="0"/>
             </w:pPr>
@@ -85,6 +87,8 @@
           </w:tcPr>
           <w:p>
             <w:pPr>
+              <w:keepNext w:val="0"/>
+              <w:keepLines w:val="0"/>
               <w:jc w:val="center"/>
               <w:spacing w:after="0"/>
             </w:pPr>
@@ -102,7 +106,6 @@
       </w:tr>
       <w:tr>
         <w:trPr>
-          <w:cantSplit/>
           <w:trHeight w:val="831"/>
         </w:trPr>
         <w:tc>
@@ -113,6 +116,8 @@
           </w:tcPr>
           <w:p>
             <w:pPr>
+              <w:keepNext w:val="0"/>
+              <w:keepLines w:val="0"/>
               <w:jc w:val="center"/>
               <w:spacing w:after="0"/>
             </w:pPr>
@@ -135,6 +140,8 @@
           </w:tcPr>
           <w:p>
             <w:pPr>
+              <w:keepNext w:val="0"/>
+              <w:keepLines w:val="0"/>
               <w:jc w:val="center"/>
               <w:spacing w:after="0"/>
             </w:pPr>
@@ -152,7 +159,6 @@
       </w:tr>
       <w:tr>
         <w:trPr>
-          <w:cantSplit/>
           <w:trHeight w:val="842"/>
         </w:trPr>
         <w:tc>
@@ -163,6 +169,8 @@
           </w:tcPr>
           <w:p>
             <w:pPr>
+              <w:keepNext w:val="0"/>
+              <w:keepLines w:val="0"/>
               <w:jc w:val="center"/>
               <w:spacing w:after="0"/>
             </w:pPr>
@@ -185,6 +193,8 @@
           </w:tcPr>
           <w:p>
             <w:pPr>
+              <w:keepNext w:val="0"/>
+              <w:keepLines w:val="0"/>
               <w:jc w:val="center"/>
               <w:spacing w:after="0"/>
             </w:pPr>
@@ -202,7 +212,6 @@
       </w:tr>
       <w:tr>
         <w:trPr>
-          <w:cantSplit/>
           <w:trHeight w:val="841"/>
         </w:trPr>
         <w:tc>
@@ -213,6 +222,8 @@
           </w:tcPr>
           <w:p>
             <w:pPr>
+              <w:keepNext w:val="0"/>
+              <w:keepLines w:val="0"/>
               <w:jc w:val="center"/>
               <w:spacing w:after="0"/>
             </w:pPr>
@@ -235,6 +246,8 @@
           </w:tcPr>
           <w:p>
             <w:pPr>
+              <w:keepNext w:val="0"/>
+              <w:keepLines w:val="0"/>
               <w:jc w:val="center"/>
               <w:spacing w:after="0"/>
             </w:pPr>
@@ -252,7 +265,6 @@
       </w:tr>
       <w:tr>
         <w:trPr>
-          <w:cantSplit/>
           <w:trHeight w:val="853"/>
         </w:trPr>
         <w:tc>
@@ -263,6 +275,8 @@
           </w:tcPr>
           <w:p>
             <w:pPr>
+              <w:keepNext w:val="0"/>
+              <w:keepLines w:val="0"/>
               <w:jc w:val="center"/>
               <w:spacing w:after="0"/>
             </w:pPr>
@@ -285,6 +299,8 @@
           </w:tcPr>
           <w:p>
             <w:pPr>
+              <w:keepNext w:val="0"/>
+              <w:keepLines w:val="0"/>
               <w:jc w:val="center"/>
               <w:spacing w:after="0"/>
             </w:pPr>
@@ -335,7 +351,6 @@
       </w:tblGrid>
       <w:tr>
         <w:trPr>
-          <w:cantSplit/>
           <w:trHeight w:val="558"/>
         </w:trPr>
         <w:tc>
@@ -346,6 +361,8 @@
           </w:tcPr>
           <w:p>
             <w:pPr>
+              <w:keepNext w:val="0"/>
+              <w:keepLines w:val="0"/>
               <w:jc w:val="center"/>
               <w:spacing w:after="0"/>
             </w:pPr>
@@ -368,6 +385,8 @@
           </w:tcPr>
           <w:p>
             <w:pPr>
+              <w:keepNext w:val="0"/>
+              <w:keepLines w:val="0"/>
               <w:jc w:val="center"/>
               <w:spacing w:after="0"/>
             </w:pPr>
@@ -385,7 +404,6 @@
       </w:tr>
       <w:tr>
         <w:trPr>
-          <w:cantSplit/>
           <w:trHeight w:val="558"/>
         </w:trPr>
         <w:tc>
@@ -396,6 +414,8 @@
           </w:tcPr>
           <w:p>
             <w:pPr>
+              <w:keepNext w:val="0"/>
+              <w:keepLines w:val="0"/>
               <w:jc w:val="center"/>
               <w:spacing w:after="0"/>
             </w:pPr>
@@ -418,6 +438,8 @@
           </w:tcPr>
           <w:p>
             <w:pPr>
+              <w:keepNext w:val="0"/>
+              <w:keepLines w:val="0"/>
               <w:jc w:val="center"/>
               <w:spacing w:after="0"/>
             </w:pPr>
@@ -435,7 +457,6 @@
       </w:tr>
       <w:tr>
         <w:trPr>
-          <w:cantSplit/>
           <w:trHeight w:val="558"/>
         </w:trPr>
         <w:tc>
@@ -446,6 +467,8 @@
           </w:tcPr>
           <w:p>
             <w:pPr>
+              <w:keepNext w:val="0"/>
+              <w:keepLines w:val="0"/>
               <w:jc w:val="center"/>
               <w:spacing w:after="0"/>
             </w:pPr>
@@ -468,6 +491,8 @@
           </w:tcPr>
           <w:p>
             <w:pPr>
+              <w:keepNext w:val="0"/>
+              <w:keepLines w:val="0"/>
               <w:jc w:val="center"/>
               <w:spacing w:after="0"/>
             </w:pPr>
@@ -518,7 +543,6 @@
       </w:tblGrid>
       <w:tr>
         <w:trPr>
-          <w:cantSplit/>
           <w:trHeight w:val="703"/>
         </w:trPr>
         <w:tc>
@@ -529,6 +553,8 @@
           </w:tcPr>
           <w:p>
             <w:pPr>
+              <w:keepNext w:val="0"/>
+              <w:keepLines w:val="0"/>
               <w:jc w:val="center"/>
               <w:spacing w:after="0"/>
             </w:pPr>
@@ -551,6 +577,8 @@
           </w:tcPr>
           <w:p>
             <w:pPr>
+              <w:keepNext w:val="0"/>
+              <w:keepLines w:val="0"/>
               <w:jc w:val="center"/>
               <w:spacing w:after="0"/>
             </w:pPr>
@@ -573,6 +601,8 @@
           </w:tcPr>
           <w:p>
             <w:pPr>
+              <w:keepNext w:val="0"/>
+              <w:keepLines w:val="0"/>
               <w:jc w:val="center"/>
               <w:spacing w:after="0"/>
             </w:pPr>
@@ -590,7 +620,6 @@
       </w:tr>
       <w:tr>
         <w:trPr>
-          <w:cantSplit/>
           <w:trHeight w:val="700"/>
         </w:trPr>
         <w:tc>
@@ -601,6 +630,8 @@
           </w:tcPr>
           <w:p>
             <w:pPr>
+              <w:keepNext w:val="0"/>
+              <w:keepLines w:val="0"/>
               <w:jc w:val="center"/>
               <w:spacing w:after="0"/>
             </w:pPr>
@@ -623,6 +654,8 @@
           </w:tcPr>
           <w:p>
             <w:pPr>
+              <w:keepNext w:val="0"/>
+              <w:keepLines w:val="0"/>
               <w:jc w:val="center"/>
               <w:spacing w:after="0"/>
             </w:pPr>
@@ -640,7 +673,6 @@
       </w:tr>
       <w:tr>
         <w:trPr>
-          <w:cantSplit/>
           <w:trHeight w:val="696"/>
         </w:trPr>
         <w:tc>
@@ -651,6 +683,8 @@
           </w:tcPr>
           <w:p>
             <w:pPr>
+              <w:keepNext w:val="0"/>
+              <w:keepLines w:val="0"/>
               <w:jc w:val="center"/>
               <w:spacing w:after="0"/>
             </w:pPr>
@@ -673,6 +707,8 @@
           </w:tcPr>
           <w:p>
             <w:pPr>
+              <w:keepNext w:val="0"/>
+              <w:keepLines w:val="0"/>
               <w:jc w:val="center"/>
               <w:spacing w:after="0"/>
             </w:pPr>
@@ -690,7 +726,6 @@
       </w:tr>
       <w:tr>
         <w:trPr>
-          <w:cantSplit/>
           <w:trHeight w:val="705"/>
         </w:trPr>
         <w:tc>
@@ -701,6 +736,8 @@
           </w:tcPr>
           <w:p>
             <w:pPr>
+              <w:keepNext w:val="0"/>
+              <w:keepLines w:val="0"/>
               <w:jc w:val="center"/>
               <w:spacing w:after="0"/>
             </w:pPr>
@@ -723,6 +760,8 @@
           </w:tcPr>
           <w:p>
             <w:pPr>
+              <w:keepNext w:val="0"/>
+              <w:keepLines w:val="0"/>
               <w:jc w:val="center"/>
               <w:spacing w:after="0"/>
             </w:pPr>
@@ -740,7 +779,6 @@
       </w:tr>
       <w:tr>
         <w:trPr>
-          <w:cantSplit/>
           <w:trHeight w:val="687"/>
         </w:trPr>
         <w:tc>
@@ -751,6 +789,8 @@
           </w:tcPr>
           <w:p>
             <w:pPr>
+              <w:keepNext w:val="0"/>
+              <w:keepLines w:val="0"/>
               <w:jc w:val="center"/>
               <w:spacing w:after="0"/>
             </w:pPr>
@@ -773,6 +813,8 @@
           </w:tcPr>
           <w:p>
             <w:pPr>
+              <w:keepNext w:val="0"/>
+              <w:keepLines w:val="0"/>
               <w:jc w:val="center"/>
               <w:spacing w:after="0"/>
             </w:pPr>
@@ -798,6 +840,8 @@
           </w:tcPr>
           <w:p>
             <w:pPr>
+              <w:keepNext w:val="0"/>
+              <w:keepLines w:val="0"/>
               <w:jc w:val="left"/>
               <w:snapToGrid w:val="0"/>
               <w:widowControl/>

</xml_diff>